<commit_message>
SongOfSongs 배지 정밀화 (OT 전수조사): 2곳 (EN+KO) — ch2 P7 '11-14'→'10-14', ch8 P6 '9'→'8-9'. 독스 8/8 export-back OK.
</commit_message>
<xml_diff>
--- a/gdocs_build/SongOfSongs.docx
+++ b/gdocs_build/SongOfSongs.docx
@@ -1296,7 +1296,7 @@
                 <w:b/>
                 <w:sz w:val="16"/>
               </w:rPr>
-              <w:t>11-14</w:t>
+              <w:t>10-14</w:t>
             </w:r>
           </w:p>
           <w:p>
@@ -1319,7 +1319,7 @@
                 <w:b/>
                 <w:sz w:val="16"/>
               </w:rPr>
-              <w:t>11-14</w:t>
+              <w:t>10-14</w:t>
             </w:r>
           </w:p>
           <w:p>
@@ -1342,7 +1342,7 @@
                 <w:b/>
                 <w:sz w:val="16"/>
               </w:rPr>
-              <w:t>11-14</w:t>
+              <w:t>10-14</w:t>
             </w:r>
           </w:p>
           <w:p>
@@ -3170,7 +3170,7 @@
                 <w:b/>
                 <w:sz w:val="16"/>
               </w:rPr>
-              <w:t>10-16</w:t>
+              <w:t>16</w:t>
             </w:r>
           </w:p>
           <w:p>
@@ -3193,7 +3193,7 @@
                 <w:b/>
                 <w:sz w:val="16"/>
               </w:rPr>
-              <w:t>10-16</w:t>
+              <w:t>16</w:t>
             </w:r>
           </w:p>
           <w:p>
@@ -3216,7 +3216,7 @@
                 <w:b/>
                 <w:sz w:val="16"/>
               </w:rPr>
-              <w:t>10-16</w:t>
+              <w:t>16</w:t>
             </w:r>
           </w:p>
           <w:p>
@@ -4127,7 +4127,7 @@
                 <w:b/>
                 <w:sz w:val="16"/>
               </w:rPr>
-              <w:t>11-12</w:t>
+              <w:t>11</w:t>
             </w:r>
           </w:p>
           <w:p>
@@ -4150,7 +4150,7 @@
                 <w:b/>
                 <w:sz w:val="16"/>
               </w:rPr>
-              <w:t>11-12</w:t>
+              <w:t>11</w:t>
             </w:r>
           </w:p>
           <w:p>
@@ -4173,7 +4173,7 @@
                 <w:b/>
                 <w:sz w:val="16"/>
               </w:rPr>
-              <w:t>11-12</w:t>
+              <w:t>11</w:t>
             </w:r>
           </w:p>
           <w:p>
@@ -4198,7 +4198,7 @@
                 <w:b/>
                 <w:sz w:val="16"/>
               </w:rPr>
-              <w:t>11-12</w:t>
+              <w:t>12</w:t>
             </w:r>
           </w:p>
           <w:p>
@@ -4221,7 +4221,7 @@
                 <w:b/>
                 <w:sz w:val="16"/>
               </w:rPr>
-              <w:t>11-12</w:t>
+              <w:t>12</w:t>
             </w:r>
           </w:p>
           <w:p>
@@ -4244,7 +4244,7 @@
                 <w:b/>
                 <w:sz w:val="16"/>
               </w:rPr>
-              <w:t>11-12</w:t>
+              <w:t>12</w:t>
             </w:r>
           </w:p>
           <w:p>
@@ -4452,7 +4452,7 @@
                 <w:b/>
                 <w:sz w:val="16"/>
               </w:rPr>
-              <w:t>1-8</w:t>
+              <w:t>1-9</w:t>
             </w:r>
           </w:p>
           <w:p>
@@ -4475,7 +4475,7 @@
                 <w:b/>
                 <w:sz w:val="16"/>
               </w:rPr>
-              <w:t>1-8</w:t>
+              <w:t>1-9</w:t>
             </w:r>
           </w:p>
           <w:p>
@@ -4498,7 +4498,7 @@
                 <w:b/>
                 <w:sz w:val="16"/>
               </w:rPr>
-              <w:t>1-8</w:t>
+              <w:t>1-9</w:t>
             </w:r>
           </w:p>
           <w:p>
@@ -4523,7 +4523,7 @@
                 <w:b/>
                 <w:sz w:val="16"/>
               </w:rPr>
-              <w:t>9-11</w:t>
+              <w:t>9-12</w:t>
             </w:r>
           </w:p>
           <w:p>
@@ -4546,7 +4546,7 @@
                 <w:b/>
                 <w:sz w:val="16"/>
               </w:rPr>
-              <w:t>9-11</w:t>
+              <w:t>9-12</w:t>
             </w:r>
           </w:p>
           <w:p>
@@ -4569,7 +4569,7 @@
                 <w:b/>
                 <w:sz w:val="16"/>
               </w:rPr>
-              <w:t>9-11</w:t>
+              <w:t>9-12</w:t>
             </w:r>
           </w:p>
           <w:p>
@@ -4594,22 +4594,7 @@
                 <w:b/>
                 <w:sz w:val="16"/>
               </w:rPr>
-              <w:t>12-13</w:t>
-            </w:r>
-          </w:p>
-          <w:p>
-            <w:r>
-              <w:rPr>
-                <w:sz w:val="18"/>
-              </w:rPr>
-              <w:t>Yes, and yours are, too—my love's kisses      flow from his lips to mine.  I am my lover's.      I'm all he wants. I'm all the world to him!  Come, dear lover—      let's tramp through the countryside.  Let's sleep at some wayside inn,      then rise early and listen to bird-song.  Let's look for wildflowers in bloom,      blackberry bushes blossoming white,  Fruit trees adorned      with cascading flowers.  And there I'll give myself to you,      my love to your love!</w:t>
-            </w:r>
-          </w:p>
-          <w:p>
-            <w:r>
-              <w:rPr>
-                <w:sz w:val="18"/>
-              </w:rPr>
+              <w:t>13</w:t>
             </w:r>
           </w:p>
           <w:p>
@@ -4632,7 +4617,7 @@
                 <w:b/>
                 <w:sz w:val="16"/>
               </w:rPr>
-              <w:t>12-13</w:t>
+              <w:t>13</w:t>
             </w:r>
           </w:p>
           <w:p>
@@ -4655,7 +4640,7 @@
                 <w:b/>
                 <w:sz w:val="16"/>
               </w:rPr>
-              <w:t>12-13</w:t>
+              <w:t>13</w:t>
             </w:r>
           </w:p>
           <w:p>
@@ -5110,7 +5095,7 @@
                 <w:b/>
                 <w:sz w:val="16"/>
               </w:rPr>
-              <w:t>9</w:t>
+              <w:t>8-9</w:t>
             </w:r>
           </w:p>
           <w:p>
@@ -5133,7 +5118,7 @@
                 <w:b/>
                 <w:sz w:val="16"/>
               </w:rPr>
-              <w:t>9</w:t>
+              <w:t>8-9</w:t>
             </w:r>
           </w:p>
           <w:p>
@@ -5156,7 +5141,7 @@
                 <w:b/>
                 <w:sz w:val="16"/>
               </w:rPr>
-              <w:t>9</w:t>
+              <w:t>8-9</w:t>
             </w:r>
           </w:p>
           <w:p>

</xml_diff>